<commit_message>
docs(dl): logistic_regression Part 2 DOCX expanded with MLE section
</commit_message>
<xml_diff>
--- a/01_neural_networks_and_dl/docs/Deep_Learning_Part_2_Logistic_Regression_as_a_Neural_Network.docx
+++ b/01_neural_networks_and_dl/docs/Deep_Learning_Part_2_Logistic_Regression_as_a_Neural_Network.docx
@@ -223,7 +223,7 @@
           <w:sz w:val="22"/>
           <w:szCs w:val="22"/>
         </w:rPr>
-        <w:t xml:space="preserve">8. Summary</w:t>
+        <w:t xml:space="preserve">8. Maximum Likelihood Justification for Cross-Entropy</w:t>
       </w:r>
     </w:p>
     <w:p>
@@ -239,7 +239,23 @@
           <w:sz w:val="22"/>
           <w:szCs w:val="22"/>
         </w:rPr>
-        <w:t xml:space="preserve">9. References</w:t>
+        <w:t xml:space="preserve">9. Summary</w:t>
+      </w:r>
+    </w:p>
+    <w:p>
+      <w:pPr>
+        <w:tabs>
+          <w:tab w:val="right" w:pos="9026"/>
+        </w:tabs>
+        <w:spacing w:after="80" w:before="80"/>
+      </w:pPr>
+      <w:r>
+        <w:rPr>
+          <w:rFonts w:ascii="Arial" w:cs="Arial" w:eastAsia="Arial" w:hAnsi="Arial"/>
+          <w:sz w:val="22"/>
+          <w:szCs w:val="22"/>
+        </w:rPr>
+        <w:t xml:space="preserve">10. References</w:t>
       </w:r>
     </w:p>
     <w:p>
@@ -7726,7 +7742,781 @@
           <w:sz w:val="32"/>
           <w:szCs w:val="32"/>
         </w:rPr>
-        <w:t xml:space="preserve">8. Summary</w:t>
+        <w:t xml:space="preserve">8. Maximum Likelihood Justification for Cross-Entropy</w:t>
+      </w:r>
+    </w:p>
+    <w:p>
+      <w:r>
+        <w:t xml:space="preserve"/>
+      </w:r>
+    </w:p>
+    <w:p>
+      <w:pPr>
+        <w:pStyle w:val="Heading2"/>
+      </w:pPr>
+      <w:r>
+        <w:rPr>
+          <w:rFonts w:ascii="Arial" w:cs="Arial" w:eastAsia="Arial" w:hAnsi="Arial"/>
+          <w:b/>
+          <w:bCs/>
+          <w:sz w:val="28"/>
+          <w:szCs w:val="28"/>
+        </w:rPr>
+        <w:t xml:space="preserve">8.1 Definition</w:t>
+      </w:r>
+    </w:p>
+    <w:p>
+      <w:r>
+        <w:t xml:space="preserve"/>
+      </w:r>
+    </w:p>
+    <w:p>
+      <w:pPr>
+        <w:spacing w:after="60" w:before="120"/>
+      </w:pPr>
+      <w:r>
+        <w:rPr>
+          <w:rFonts w:ascii="Arial" w:cs="Arial" w:eastAsia="Arial" w:hAnsi="Arial"/>
+          <w:b/>
+          <w:bCs/>
+          <w:sz w:val="22"/>
+          <w:szCs w:val="22"/>
+        </w:rPr>
+        <w:t xml:space="preserve">Definition (Bernoulli Likelihood). </w:t>
+      </w:r>
+      <w:r>
+        <w:rPr>
+          <w:rFonts w:ascii="Arial" w:cs="Arial" w:eastAsia="Arial" w:hAnsi="Arial"/>
+          <w:sz w:val="22"/>
+          <w:szCs w:val="22"/>
+        </w:rPr>
+        <w:t xml:space="preserve">For a single binary example with true label y ∈ {0,1} and predicted probability ŷ = σ(wᵀx+b), the probability of the observed label under the model is: P(y|x) = ŷʸ (1−ŷ)¹⁻ʸ. This single expression encodes both cases: when y=1 it equals ŷ; when y=0 it equals 1−ŷ.</w:t>
+      </w:r>
+    </w:p>
+    <w:p>
+      <w:r>
+        <w:t xml:space="preserve"/>
+      </w:r>
+    </w:p>
+    <w:p>
+      <w:pPr>
+        <w:spacing w:after="60" w:before="120"/>
+      </w:pPr>
+      <w:r>
+        <w:rPr>
+          <w:rFonts w:ascii="Arial" w:cs="Arial" w:eastAsia="Arial" w:hAnsi="Arial"/>
+          <w:b/>
+          <w:bCs/>
+          <w:sz w:val="22"/>
+          <w:szCs w:val="22"/>
+        </w:rPr>
+        <w:t xml:space="preserve">Definition (Log-Likelihood). </w:t>
+      </w:r>
+      <w:r>
+        <w:rPr>
+          <w:rFonts w:ascii="Arial" w:cs="Arial" w:eastAsia="Arial" w:hAnsi="Arial"/>
+          <w:sz w:val="22"/>
+          <w:szCs w:val="22"/>
+        </w:rPr>
+        <w:t xml:space="preserve">The log-likelihood of a single example is log P(y|x) = y log ŷ + (1−y) log(1−ŷ). Negating this gives exactly the binary cross-entropy loss ℒ(ŷ, y). Minimising the loss is therefore equivalent to maximising the log-likelihood.</w:t>
+      </w:r>
+    </w:p>
+    <w:p>
+      <w:r>
+        <w:t xml:space="preserve"/>
+      </w:r>
+    </w:p>
+    <w:p>
+      <w:pPr>
+        <w:spacing w:after="60" w:before="120"/>
+      </w:pPr>
+      <w:r>
+        <w:rPr>
+          <w:rFonts w:ascii="Arial" w:cs="Arial" w:eastAsia="Arial" w:hAnsi="Arial"/>
+          <w:b/>
+          <w:bCs/>
+          <w:sz w:val="22"/>
+          <w:szCs w:val="22"/>
+        </w:rPr>
+        <w:t xml:space="preserve">Definition (IID Assumption). </w:t>
+      </w:r>
+      <w:r>
+        <w:rPr>
+          <w:rFonts w:ascii="Arial" w:cs="Arial" w:eastAsia="Arial" w:hAnsi="Arial"/>
+          <w:sz w:val="22"/>
+          <w:szCs w:val="22"/>
+        </w:rPr>
+        <w:t xml:space="preserve">The m training examples are assumed to be independent and identically distributed (IID): each (x⁽ᴵ⁾, y⁽ᴵ⁾) is drawn independently from the same distribution. Under this assumption, the joint likelihood of the entire training set is the product of individual likelihoods.</w:t>
+      </w:r>
+    </w:p>
+    <w:p>
+      <w:r>
+        <w:t xml:space="preserve"/>
+      </w:r>
+    </w:p>
+    <w:p>
+      <w:pPr>
+        <w:pStyle w:val="Heading2"/>
+      </w:pPr>
+      <w:r>
+        <w:rPr>
+          <w:rFonts w:ascii="Arial" w:cs="Arial" w:eastAsia="Arial" w:hAnsi="Arial"/>
+          <w:b/>
+          <w:bCs/>
+          <w:sz w:val="28"/>
+          <w:szCs w:val="28"/>
+        </w:rPr>
+        <w:t xml:space="preserve">8.2 Mathematical Motivation</w:t>
+      </w:r>
+    </w:p>
+    <w:p>
+      <w:r>
+        <w:t xml:space="preserve"/>
+      </w:r>
+    </w:p>
+    <w:p>
+      <w:pPr>
+        <w:spacing w:after="80" w:before="80"/>
+      </w:pPr>
+      <w:r>
+        <w:rPr>
+          <w:rFonts w:ascii="Arial" w:cs="Arial" w:eastAsia="Arial" w:hAnsi="Arial"/>
+          <w:sz w:val="22"/>
+          <w:szCs w:val="22"/>
+        </w:rPr>
+        <w:t xml:space="preserve">Why should the cross-entropy loss be the right loss function for logistic regression? The answer comes from probability theory. We model each label y⁽ᴵ⁾ as a Bernoulli random variable with success probability ŷ⁽ᴵ⁾ = σ(wᵀx⁽ᴵ⁾ + b). The question then becomes: what parameters w and b make the observed labels as probable as possible under this model? This is the principle of maximum likelihood estimation (MLE).</w:t>
+      </w:r>
+    </w:p>
+    <w:p>
+      <w:r>
+        <w:t xml:space="preserve"/>
+      </w:r>
+    </w:p>
+    <w:p>
+      <w:pPr>
+        <w:spacing w:after="80" w:before="80"/>
+      </w:pPr>
+      <w:r>
+        <w:rPr>
+          <w:rFonts w:ascii="Arial" w:cs="Arial" w:eastAsia="Arial" w:hAnsi="Arial"/>
+          <w:sz w:val="22"/>
+          <w:szCs w:val="22"/>
+        </w:rPr>
+        <w:t xml:space="preserve">MLE says: choose w and b to maximise the probability of the observed training data. Under the IID assumption, that probability is the product P(y⁽¹⁾|x⁽¹⁾) × P(y⁽²⁾|x⁽²⁾) × ⋯ × P(y⁽ᵐ⁾|x⁽ᵐ⁾). Products of many small probabilities quickly underflow to zero in floating point, so we maximise the log-likelihood instead — which is a sum and is numerically safe. Because log is monotonically increasing, the maximiser of the log-likelihood is the same as the maximiser of the likelihood.</w:t>
+      </w:r>
+    </w:p>
+    <w:p>
+      <w:r>
+        <w:t xml:space="preserve"/>
+      </w:r>
+    </w:p>
+    <w:p>
+      <w:pPr>
+        <w:spacing w:after="80" w:before="80"/>
+      </w:pPr>
+      <w:r>
+        <w:rPr>
+          <w:rFonts w:ascii="Arial" w:cs="Arial" w:eastAsia="Arial" w:hAnsi="Arial"/>
+          <w:sz w:val="22"/>
+          <w:szCs w:val="22"/>
+        </w:rPr>
+        <w:t xml:space="preserve">Taking the log of the product converts it to a sum: log ∏ᴵ P(y⁽ᴵ⁾|x⁽ᴵ⁾) = Σᴵ log P(y⁽ᴵ⁾|x⁽ᴵ⁾) = Σᴵ [y⁽ᴵ⁾ log ŷ⁽ᴵ⁾ + (1−y⁽ᴵ⁾) log(1−ŷ⁽ᴵ⁾)]. Negating and dividing by m converts maximisation into minimisation and gives the cost function J(w,b) exactly. The 1/m factor is a constant scaling that does not affect the location of the minimum but keeps gradient magnitudes independent of dataset size.</w:t>
+      </w:r>
+    </w:p>
+    <w:p>
+      <w:r>
+        <w:t xml:space="preserve"/>
+      </w:r>
+    </w:p>
+    <w:p>
+      <w:pPr>
+        <w:pStyle w:val="Heading2"/>
+      </w:pPr>
+      <w:r>
+        <w:rPr>
+          <w:rFonts w:ascii="Arial" w:cs="Arial" w:eastAsia="Arial" w:hAnsi="Arial"/>
+          <w:b/>
+          <w:bCs/>
+          <w:sz w:val="28"/>
+          <w:szCs w:val="28"/>
+        </w:rPr>
+        <w:t xml:space="preserve">8.3 Key Theorems and Properties</w:t>
+      </w:r>
+    </w:p>
+    <w:p>
+      <w:r>
+        <w:t xml:space="preserve"/>
+      </w:r>
+    </w:p>
+    <w:p>
+      <w:pPr>
+        <w:spacing w:after="80" w:before="80"/>
+      </w:pPr>
+      <w:r>
+        <w:rPr>
+          <w:rFonts w:ascii="Arial" w:cs="Arial" w:eastAsia="Arial" w:hAnsi="Arial"/>
+          <w:b/>
+          <w:bCs/>
+          <w:sz w:val="22"/>
+          <w:szCs w:val="22"/>
+        </w:rPr>
+        <w:t xml:space="preserve">Theorem (MLE ↔ Cross-Entropy).</w:t>
+      </w:r>
+      <w:r>
+        <w:rPr>
+          <w:rFonts w:ascii="Arial" w:cs="Arial" w:eastAsia="Arial" w:hAnsi="Arial"/>
+          <w:sz w:val="22"/>
+          <w:szCs w:val="22"/>
+        </w:rPr>
+        <w:t xml:space="preserve"> Minimising the binary cross-entropy cost J(w,b) = −(1/m)Σᴵ[y⁽ᴵ⁾ log ŷ⁽ᴵ⁾ + (1−y⁽ᴵ⁾) log(1−ŷ⁽ᴵ⁾)] is equivalent to maximum likelihood estimation of a logistic regression model under the IID Bernoulli assumption. Proof sketch: negate and divide the log-likelihood by m; the result is exactly J(w,b). The MLE solution is the same as the cost minimiser. □</w:t>
+      </w:r>
+    </w:p>
+    <w:p>
+      <w:r>
+        <w:t xml:space="preserve"/>
+      </w:r>
+    </w:p>
+    <w:p>
+      <w:pPr>
+        <w:spacing w:after="80" w:before="80"/>
+      </w:pPr>
+      <w:r>
+        <w:rPr>
+          <w:rFonts w:ascii="Arial" w:cs="Arial" w:eastAsia="Arial" w:hAnsi="Arial"/>
+          <w:b/>
+          <w:bCs/>
+          <w:sz w:val="22"/>
+          <w:szCs w:val="22"/>
+        </w:rPr>
+        <w:t xml:space="preserve">Theorem (Bernoulli Encoding).</w:t>
+      </w:r>
+      <w:r>
+        <w:rPr>
+          <w:rFonts w:ascii="Arial" w:cs="Arial" w:eastAsia="Arial" w:hAnsi="Arial"/>
+          <w:sz w:val="22"/>
+          <w:szCs w:val="22"/>
+        </w:rPr>
+        <w:t xml:space="preserve"> The expression ŷʸ(1−ŷ)¹⁻ʸ encodes P(y=1|x) = ŷ and P(y=0|x) = 1−ŷ simultaneously. Proof sketch: substitute y=1 → ŷ¹(1−ŷ)⁰ = ŷ. Substitute y=0 → ŷ⁰(1−ŷ)¹ = 1−ŷ. Both cases match the definition of a Bernoulli distribution. □</w:t>
+      </w:r>
+    </w:p>
+    <w:p>
+      <w:r>
+        <w:t xml:space="preserve"/>
+      </w:r>
+    </w:p>
+    <w:p>
+      <w:pPr>
+        <w:spacing w:after="80" w:before="80"/>
+      </w:pPr>
+      <w:r>
+        <w:rPr>
+          <w:rFonts w:ascii="Arial" w:cs="Arial" w:eastAsia="Arial" w:hAnsi="Arial"/>
+          <w:sz w:val="22"/>
+          <w:szCs w:val="22"/>
+        </w:rPr>
+        <w:t xml:space="preserve">This theorem explains why cross-entropy is not an arbitrary choice: it is the unique loss function that corresponds to maximum likelihood for a Bernoulli output distribution. Any other loss function would be optimising a different statistical objective and would not have the same probabilistic interpretation.</w:t>
+      </w:r>
+    </w:p>
+    <w:p>
+      <w:r>
+        <w:t xml:space="preserve"/>
+      </w:r>
+    </w:p>
+    <w:p>
+      <w:pPr>
+        <w:pStyle w:val="Heading2"/>
+      </w:pPr>
+      <w:r>
+        <w:rPr>
+          <w:rFonts w:ascii="Arial" w:cs="Arial" w:eastAsia="Arial" w:hAnsi="Arial"/>
+          <w:b/>
+          <w:bCs/>
+          <w:sz w:val="28"/>
+          <w:szCs w:val="28"/>
+        </w:rPr>
+        <w:t xml:space="preserve">8.4 Domain Relevance</w:t>
+      </w:r>
+    </w:p>
+    <w:p>
+      <w:r>
+        <w:t xml:space="preserve"/>
+      </w:r>
+    </w:p>
+    <w:p>
+      <w:pPr>
+        <w:spacing w:after="80" w:before="80"/>
+      </w:pPr>
+      <w:r>
+        <w:rPr>
+          <w:rFonts w:ascii="Arial" w:cs="Arial" w:eastAsia="Arial" w:hAnsi="Arial"/>
+          <w:sz w:val="22"/>
+          <w:szCs w:val="22"/>
+        </w:rPr>
+        <w:t xml:space="preserve">Maximum likelihood estimation is the unifying principle behind most loss functions in deep learning. For regression with a Gaussian noise model, MLE gives the mean-squared-error loss. For multi-class classification with a categorical distribution, MLE gives categorical cross-entropy. For sequence modelling with an autoregressive model, MLE gives the sum of per-token log-probabilities. Understanding MLE therefore gives a single principled explanation for why the loss functions used across all these tasks take the forms they do.</w:t>
+      </w:r>
+    </w:p>
+    <w:p>
+      <w:r>
+        <w:t xml:space="preserve"/>
+      </w:r>
+    </w:p>
+    <w:p>
+      <w:pPr>
+        <w:spacing w:after="80" w:before="80"/>
+      </w:pPr>
+      <w:r>
+        <w:rPr>
+          <w:rFonts w:ascii="Arial" w:cs="Arial" w:eastAsia="Arial" w:hAnsi="Arial"/>
+          <w:sz w:val="22"/>
+          <w:szCs w:val="22"/>
+        </w:rPr>
+        <w:t xml:space="preserve">The IID assumption is almost always violated in practice — text sequences are not independent, medical records from the same patient are not independent, frames in a video are not independent. Despite this, MLE with cross-entropy still produces well-calibrated and performant models in most cases. The practical robustness of MLE to mild IID violations is an empirical observation rather than a theoretical guarantee, and understanding this distinction is important when reasoning about model calibration and generalisation.</w:t>
+      </w:r>
+    </w:p>
+    <w:p>
+      <w:r>
+        <w:t xml:space="preserve"/>
+      </w:r>
+    </w:p>
+    <w:p>
+      <w:pPr>
+        <w:pStyle w:val="Heading2"/>
+      </w:pPr>
+      <w:r>
+        <w:rPr>
+          <w:rFonts w:ascii="Arial" w:cs="Arial" w:eastAsia="Arial" w:hAnsi="Arial"/>
+          <w:b/>
+          <w:bCs/>
+          <w:sz w:val="28"/>
+          <w:szCs w:val="28"/>
+        </w:rPr>
+        <w:t xml:space="preserve">8.5 Common Errors and Misconceptions</w:t>
+      </w:r>
+    </w:p>
+    <w:p>
+      <w:r>
+        <w:t xml:space="preserve"/>
+      </w:r>
+    </w:p>
+    <w:tbl>
+      <w:tblPr>
+        <w:tblW w:type="dxa" w:w="9360"/>
+        <w:tblBorders>
+          <w:top w:val="single" w:color="auto" w:sz="4"/>
+          <w:left w:val="single" w:color="auto" w:sz="4"/>
+          <w:bottom w:val="single" w:color="auto" w:sz="4"/>
+          <w:right w:val="single" w:color="auto" w:sz="4"/>
+          <w:insideH w:val="single" w:color="auto" w:sz="4"/>
+          <w:insideV w:val="single" w:color="auto" w:sz="4"/>
+        </w:tblBorders>
+      </w:tblPr>
+      <w:tblGrid>
+        <w:gridCol w:w="3600"/>
+        <w:gridCol w:w="5760"/>
+      </w:tblGrid>
+      <w:tr>
+        <w:tc>
+          <w:tcPr>
+            <w:tcW w:type="dxa" w:w="3600"/>
+            <w:tcBorders>
+              <w:top w:val="single" w:color="CCCCCC" w:sz="1"/>
+              <w:left w:val="single" w:color="CCCCCC" w:sz="1"/>
+              <w:bottom w:val="single" w:color="CCCCCC" w:sz="1"/>
+              <w:right w:val="single" w:color="CCCCCC" w:sz="1"/>
+            </w:tcBorders>
+            <w:shd w:fill="D5E8F0" w:val="clear"/>
+            <w:tcMar>
+              <w:top w:type="dxa" w:w="80"/>
+              <w:left w:type="dxa" w:w="120"/>
+              <w:bottom w:type="dxa" w:w="80"/>
+              <w:right w:type="dxa" w:w="120"/>
+            </w:tcMar>
+            <w:vAlign w:val="top"/>
+          </w:tcPr>
+          <w:p>
+            <w:r>
+              <w:rPr>
+                <w:rFonts w:ascii="Arial" w:cs="Arial" w:eastAsia="Arial" w:hAnsi="Arial"/>
+                <w:b/>
+                <w:bCs/>
+                <w:sz w:val="22"/>
+                <w:szCs w:val="22"/>
+              </w:rPr>
+              <w:t xml:space="preserve">Question</w:t>
+            </w:r>
+          </w:p>
+        </w:tc>
+        <w:tc>
+          <w:tcPr>
+            <w:tcW w:type="dxa" w:w="5760"/>
+            <w:tcBorders>
+              <w:top w:val="single" w:color="CCCCCC" w:sz="1"/>
+              <w:left w:val="single" w:color="CCCCCC" w:sz="1"/>
+              <w:bottom w:val="single" w:color="CCCCCC" w:sz="1"/>
+              <w:right w:val="single" w:color="CCCCCC" w:sz="1"/>
+            </w:tcBorders>
+            <w:shd w:fill="D5E8F0" w:val="clear"/>
+            <w:tcMar>
+              <w:top w:type="dxa" w:w="80"/>
+              <w:left w:type="dxa" w:w="120"/>
+              <w:bottom w:type="dxa" w:w="80"/>
+              <w:right w:type="dxa" w:w="120"/>
+            </w:tcMar>
+            <w:vAlign w:val="top"/>
+          </w:tcPr>
+          <w:p>
+            <w:r>
+              <w:rPr>
+                <w:rFonts w:ascii="Arial" w:cs="Arial" w:eastAsia="Arial" w:hAnsi="Arial"/>
+                <w:b/>
+                <w:bCs/>
+                <w:sz w:val="22"/>
+                <w:szCs w:val="22"/>
+              </w:rPr>
+              <w:t xml:space="preserve">Answer</w:t>
+            </w:r>
+          </w:p>
+        </w:tc>
+      </w:tr>
+      <w:tr>
+        <w:tc>
+          <w:tcPr>
+            <w:tcW w:type="dxa" w:w="3600"/>
+            <w:tcBorders>
+              <w:top w:val="single" w:color="CCCCCC" w:sz="1"/>
+              <w:left w:val="single" w:color="CCCCCC" w:sz="1"/>
+              <w:bottom w:val="single" w:color="CCCCCC" w:sz="1"/>
+              <w:right w:val="single" w:color="CCCCCC" w:sz="1"/>
+            </w:tcBorders>
+            <w:shd w:fill="FFFFFF" w:val="clear"/>
+            <w:tcMar>
+              <w:top w:type="dxa" w:w="80"/>
+              <w:left w:type="dxa" w:w="120"/>
+              <w:bottom w:type="dxa" w:w="80"/>
+              <w:right w:type="dxa" w:w="120"/>
+            </w:tcMar>
+            <w:vAlign w:val="top"/>
+          </w:tcPr>
+          <w:p>
+            <w:r>
+              <w:rPr>
+                <w:rFonts w:ascii="Arial" w:cs="Arial" w:eastAsia="Arial" w:hAnsi="Arial"/>
+                <w:b w:val="false"/>
+                <w:bCs w:val="false"/>
+                <w:sz w:val="22"/>
+                <w:szCs w:val="22"/>
+              </w:rPr>
+              <w:t xml:space="preserve">Is minimising cross-entropy the same as maximising accuracy?</w:t>
+            </w:r>
+          </w:p>
+        </w:tc>
+        <w:tc>
+          <w:tcPr>
+            <w:tcW w:type="dxa" w:w="5760"/>
+            <w:tcBorders>
+              <w:top w:val="single" w:color="CCCCCC" w:sz="1"/>
+              <w:left w:val="single" w:color="CCCCCC" w:sz="1"/>
+              <w:bottom w:val="single" w:color="CCCCCC" w:sz="1"/>
+              <w:right w:val="single" w:color="CCCCCC" w:sz="1"/>
+            </w:tcBorders>
+            <w:shd w:fill="FFFFFF" w:val="clear"/>
+            <w:tcMar>
+              <w:top w:type="dxa" w:w="80"/>
+              <w:left w:type="dxa" w:w="120"/>
+              <w:bottom w:type="dxa" w:w="80"/>
+              <w:right w:type="dxa" w:w="120"/>
+            </w:tcMar>
+            <w:vAlign w:val="top"/>
+          </w:tcPr>
+          <w:p>
+            <w:r>
+              <w:rPr>
+                <w:rFonts w:ascii="Arial" w:cs="Arial" w:eastAsia="Arial" w:hAnsi="Arial"/>
+                <w:b w:val="false"/>
+                <w:bCs w:val="false"/>
+                <w:sz w:val="22"/>
+                <w:szCs w:val="22"/>
+              </w:rPr>
+              <w:t xml:space="preserve">No. Accuracy is non-differentiable and gradient descent cannot optimise it directly. Cross-entropy is a smooth surrogate that, when minimised, generally improves accuracy — but the two objectives are not equivalent. A model can have decreasing cross-entropy with flat or even slightly decreasing accuracy, especially near convergence.</w:t>
+            </w:r>
+          </w:p>
+        </w:tc>
+      </w:tr>
+      <w:tr>
+        <w:tc>
+          <w:tcPr>
+            <w:tcW w:type="dxa" w:w="3600"/>
+            <w:tcBorders>
+              <w:top w:val="single" w:color="CCCCCC" w:sz="1"/>
+              <w:left w:val="single" w:color="CCCCCC" w:sz="1"/>
+              <w:bottom w:val="single" w:color="CCCCCC" w:sz="1"/>
+              <w:right w:val="single" w:color="CCCCCC" w:sz="1"/>
+            </w:tcBorders>
+            <w:shd w:fill="FFFFFF" w:val="clear"/>
+            <w:tcMar>
+              <w:top w:type="dxa" w:w="80"/>
+              <w:left w:type="dxa" w:w="120"/>
+              <w:bottom w:type="dxa" w:w="80"/>
+              <w:right w:type="dxa" w:w="120"/>
+            </w:tcMar>
+            <w:vAlign w:val="top"/>
+          </w:tcPr>
+          <w:p>
+            <w:r>
+              <w:rPr>
+                <w:rFonts w:ascii="Arial" w:cs="Arial" w:eastAsia="Arial" w:hAnsi="Arial"/>
+                <w:b w:val="false"/>
+                <w:bCs w:val="false"/>
+                <w:sz w:val="22"/>
+                <w:szCs w:val="22"/>
+              </w:rPr>
+              <w:t xml:space="preserve">Does the 1/m factor matter for the optimum?</w:t>
+            </w:r>
+          </w:p>
+        </w:tc>
+        <w:tc>
+          <w:tcPr>
+            <w:tcW w:type="dxa" w:w="5760"/>
+            <w:tcBorders>
+              <w:top w:val="single" w:color="CCCCCC" w:sz="1"/>
+              <w:left w:val="single" w:color="CCCCCC" w:sz="1"/>
+              <w:bottom w:val="single" w:color="CCCCCC" w:sz="1"/>
+              <w:right w:val="single" w:color="CCCCCC" w:sz="1"/>
+            </w:tcBorders>
+            <w:shd w:fill="FFFFFF" w:val="clear"/>
+            <w:tcMar>
+              <w:top w:type="dxa" w:w="80"/>
+              <w:left w:type="dxa" w:w="120"/>
+              <w:bottom w:type="dxa" w:w="80"/>
+              <w:right w:type="dxa" w:w="120"/>
+            </w:tcMar>
+            <w:vAlign w:val="top"/>
+          </w:tcPr>
+          <w:p>
+            <w:r>
+              <w:rPr>
+                <w:rFonts w:ascii="Arial" w:cs="Arial" w:eastAsia="Arial" w:hAnsi="Arial"/>
+                <w:b w:val="false"/>
+                <w:bCs w:val="false"/>
+                <w:sz w:val="22"/>
+                <w:szCs w:val="22"/>
+              </w:rPr>
+              <w:t xml:space="preserve">No. Multiplying the cost by a positive constant does not change the location of the minimum. It does affect the gradient magnitude, which means a fixed learning rate produces larger or smaller steps with different m. The 1/m factor normalises this so the same learning rate works for any dataset size.</w:t>
+            </w:r>
+          </w:p>
+        </w:tc>
+      </w:tr>
+      <w:tr>
+        <w:tc>
+          <w:tcPr>
+            <w:tcW w:type="dxa" w:w="3600"/>
+            <w:tcBorders>
+              <w:top w:val="single" w:color="CCCCCC" w:sz="1"/>
+              <w:left w:val="single" w:color="CCCCCC" w:sz="1"/>
+              <w:bottom w:val="single" w:color="CCCCCC" w:sz="1"/>
+              <w:right w:val="single" w:color="CCCCCC" w:sz="1"/>
+            </w:tcBorders>
+            <w:shd w:fill="FFFFFF" w:val="clear"/>
+            <w:tcMar>
+              <w:top w:type="dxa" w:w="80"/>
+              <w:left w:type="dxa" w:w="120"/>
+              <w:bottom w:type="dxa" w:w="80"/>
+              <w:right w:type="dxa" w:w="120"/>
+            </w:tcMar>
+            <w:vAlign w:val="top"/>
+          </w:tcPr>
+          <w:p>
+            <w:r>
+              <w:rPr>
+                <w:rFonts w:ascii="Arial" w:cs="Arial" w:eastAsia="Arial" w:hAnsi="Arial"/>
+                <w:b w:val="false"/>
+                <w:bCs w:val="false"/>
+                <w:sz w:val="22"/>
+                <w:szCs w:val="22"/>
+              </w:rPr>
+              <w:t xml:space="preserve">Why take the log of the likelihood instead of maximising the likelihood directly?</w:t>
+            </w:r>
+          </w:p>
+        </w:tc>
+        <w:tc>
+          <w:tcPr>
+            <w:tcW w:type="dxa" w:w="5760"/>
+            <w:tcBorders>
+              <w:top w:val="single" w:color="CCCCCC" w:sz="1"/>
+              <w:left w:val="single" w:color="CCCCCC" w:sz="1"/>
+              <w:bottom w:val="single" w:color="CCCCCC" w:sz="1"/>
+              <w:right w:val="single" w:color="CCCCCC" w:sz="1"/>
+            </w:tcBorders>
+            <w:shd w:fill="FFFFFF" w:val="clear"/>
+            <w:tcMar>
+              <w:top w:type="dxa" w:w="80"/>
+              <w:left w:type="dxa" w:w="120"/>
+              <w:bottom w:type="dxa" w:w="80"/>
+              <w:right w:type="dxa" w:w="120"/>
+            </w:tcMar>
+            <w:vAlign w:val="top"/>
+          </w:tcPr>
+          <w:p>
+            <w:r>
+              <w:rPr>
+                <w:rFonts w:ascii="Arial" w:cs="Arial" w:eastAsia="Arial" w:hAnsi="Arial"/>
+                <w:b w:val="false"/>
+                <w:bCs w:val="false"/>
+                <w:sz w:val="22"/>
+                <w:szCs w:val="22"/>
+              </w:rPr>
+              <w:t xml:space="preserve">The likelihood is a product of m probabilities, each in (0,1). As m grows this product underflows to 0 in floating point. The log converts the product to a sum, which is numerically stable and easier to differentiate.</w:t>
+            </w:r>
+          </w:p>
+        </w:tc>
+      </w:tr>
+      <w:tr>
+        <w:tc>
+          <w:tcPr>
+            <w:tcW w:type="dxa" w:w="3600"/>
+            <w:tcBorders>
+              <w:top w:val="single" w:color="CCCCCC" w:sz="1"/>
+              <w:left w:val="single" w:color="CCCCCC" w:sz="1"/>
+              <w:bottom w:val="single" w:color="CCCCCC" w:sz="1"/>
+              <w:right w:val="single" w:color="CCCCCC" w:sz="1"/>
+            </w:tcBorders>
+            <w:shd w:fill="FFFFFF" w:val="clear"/>
+            <w:tcMar>
+              <w:top w:type="dxa" w:w="80"/>
+              <w:left w:type="dxa" w:w="120"/>
+              <w:bottom w:type="dxa" w:w="80"/>
+              <w:right w:type="dxa" w:w="120"/>
+            </w:tcMar>
+            <w:vAlign w:val="top"/>
+          </w:tcPr>
+          <w:p>
+            <w:r>
+              <w:rPr>
+                <w:rFonts w:ascii="Arial" w:cs="Arial" w:eastAsia="Arial" w:hAnsi="Arial"/>
+                <w:b w:val="false"/>
+                <w:bCs w:val="false"/>
+                <w:sz w:val="22"/>
+                <w:szCs w:val="22"/>
+              </w:rPr>
+              <w:t xml:space="preserve">Does logistic regression assume the data is Gaussian?</w:t>
+            </w:r>
+          </w:p>
+        </w:tc>
+        <w:tc>
+          <w:tcPr>
+            <w:tcW w:type="dxa" w:w="5760"/>
+            <w:tcBorders>
+              <w:top w:val="single" w:color="CCCCCC" w:sz="1"/>
+              <w:left w:val="single" w:color="CCCCCC" w:sz="1"/>
+              <w:bottom w:val="single" w:color="CCCCCC" w:sz="1"/>
+              <w:right w:val="single" w:color="CCCCCC" w:sz="1"/>
+            </w:tcBorders>
+            <w:shd w:fill="FFFFFF" w:val="clear"/>
+            <w:tcMar>
+              <w:top w:type="dxa" w:w="80"/>
+              <w:left w:type="dxa" w:w="120"/>
+              <w:bottom w:type="dxa" w:w="80"/>
+              <w:right w:type="dxa" w:w="120"/>
+            </w:tcMar>
+            <w:vAlign w:val="top"/>
+          </w:tcPr>
+          <w:p>
+            <w:r>
+              <w:rPr>
+                <w:rFonts w:ascii="Arial" w:cs="Arial" w:eastAsia="Arial" w:hAnsi="Arial"/>
+                <w:b w:val="false"/>
+                <w:bCs w:val="false"/>
+                <w:sz w:val="22"/>
+                <w:szCs w:val="22"/>
+              </w:rPr>
+              <w:t xml:space="preserve">No. Logistic regression makes a Bernoulli assumption on the label distribution — it does not assume anything about the distribution of x. Linear discriminant analysis (LDA) additionally assumes Gaussian class-conditional distributions for x. Logistic regression is more general.</w:t>
+            </w:r>
+          </w:p>
+        </w:tc>
+      </w:tr>
+      <w:tr>
+        <w:tc>
+          <w:tcPr>
+            <w:tcW w:type="dxa" w:w="3600"/>
+            <w:tcBorders>
+              <w:top w:val="single" w:color="CCCCCC" w:sz="1"/>
+              <w:left w:val="single" w:color="CCCCCC" w:sz="1"/>
+              <w:bottom w:val="single" w:color="CCCCCC" w:sz="1"/>
+              <w:right w:val="single" w:color="CCCCCC" w:sz="1"/>
+            </w:tcBorders>
+            <w:shd w:fill="FFFFFF" w:val="clear"/>
+            <w:tcMar>
+              <w:top w:type="dxa" w:w="80"/>
+              <w:left w:type="dxa" w:w="120"/>
+              <w:bottom w:type="dxa" w:w="80"/>
+              <w:right w:type="dxa" w:w="120"/>
+            </w:tcMar>
+            <w:vAlign w:val="top"/>
+          </w:tcPr>
+          <w:p>
+            <w:r>
+              <w:rPr>
+                <w:rFonts w:ascii="Arial" w:cs="Arial" w:eastAsia="Arial" w:hAnsi="Arial"/>
+                <w:b w:val="false"/>
+                <w:bCs w:val="false"/>
+                <w:sz w:val="22"/>
+                <w:szCs w:val="22"/>
+              </w:rPr>
+              <w:t xml:space="preserve">If the IID assumption is violated, should I use a different loss?</w:t>
+            </w:r>
+          </w:p>
+        </w:tc>
+        <w:tc>
+          <w:tcPr>
+            <w:tcW w:type="dxa" w:w="5760"/>
+            <w:tcBorders>
+              <w:top w:val="single" w:color="CCCCCC" w:sz="1"/>
+              <w:left w:val="single" w:color="CCCCCC" w:sz="1"/>
+              <w:bottom w:val="single" w:color="CCCCCC" w:sz="1"/>
+              <w:right w:val="single" w:color="CCCCCC" w:sz="1"/>
+            </w:tcBorders>
+            <w:shd w:fill="FFFFFF" w:val="clear"/>
+            <w:tcMar>
+              <w:top w:type="dxa" w:w="80"/>
+              <w:left w:type="dxa" w:w="120"/>
+              <w:bottom w:type="dxa" w:w="80"/>
+              <w:right w:type="dxa" w:w="120"/>
+            </w:tcMar>
+            <w:vAlign w:val="top"/>
+          </w:tcPr>
+          <w:p>
+            <w:r>
+              <w:rPr>
+                <w:rFonts w:ascii="Arial" w:cs="Arial" w:eastAsia="Arial" w:hAnsi="Arial"/>
+                <w:b w:val="false"/>
+                <w:bCs w:val="false"/>
+                <w:sz w:val="22"/>
+                <w:szCs w:val="22"/>
+              </w:rPr>
+              <w:t xml:space="preserve">Not necessarily. Cross-entropy is often robust to mild IID violations and remains the standard. For strong temporal or spatial dependencies, structured prediction losses (CRF, sequence-level MLE) may be more appropriate. In practice, always evaluate on a held-out set that matches the deployment distribution.</w:t>
+            </w:r>
+          </w:p>
+        </w:tc>
+      </w:tr>
+    </w:tbl>
+    <w:p>
+      <w:r>
+        <w:br w:type="page"/>
+      </w:r>
+    </w:p>
+    <w:p>
+      <w:pPr>
+        <w:pStyle w:val="Heading1"/>
+      </w:pPr>
+      <w:r>
+        <w:rPr>
+          <w:rFonts w:ascii="Arial" w:cs="Arial" w:eastAsia="Arial" w:hAnsi="Arial"/>
+          <w:b/>
+          <w:bCs/>
+          <w:sz w:val="32"/>
+          <w:szCs w:val="32"/>
+        </w:rPr>
+        <w:t xml:space="preserve">9. Summary</w:t>
       </w:r>
     </w:p>
     <w:p>
@@ -8634,6 +9424,132 @@
           </w:p>
         </w:tc>
       </w:tr>
+      <w:tr>
+        <w:tc>
+          <w:tcPr>
+            <w:tcW w:type="dxa" w:w="1500"/>
+            <w:tcBorders>
+              <w:top w:val="single" w:color="CCCCCC" w:sz="1"/>
+              <w:left w:val="single" w:color="CCCCCC" w:sz="1"/>
+              <w:bottom w:val="single" w:color="CCCCCC" w:sz="1"/>
+              <w:right w:val="single" w:color="CCCCCC" w:sz="1"/>
+            </w:tcBorders>
+            <w:shd w:fill="FFFFFF" w:val="clear"/>
+            <w:tcMar>
+              <w:top w:type="dxa" w:w="80"/>
+              <w:left w:type="dxa" w:w="120"/>
+              <w:bottom w:type="dxa" w:w="80"/>
+              <w:right w:type="dxa" w:w="120"/>
+            </w:tcMar>
+            <w:vAlign w:val="top"/>
+          </w:tcPr>
+          <w:p>
+            <w:r>
+              <w:rPr>
+                <w:rFonts w:ascii="Arial" w:cs="Arial" w:eastAsia="Arial" w:hAnsi="Arial"/>
+                <w:b w:val="false"/>
+                <w:bCs w:val="false"/>
+                <w:sz w:val="22"/>
+                <w:szCs w:val="22"/>
+              </w:rPr>
+              <w:t xml:space="preserve">MLE &amp; Cross-Entropy</w:t>
+            </w:r>
+          </w:p>
+        </w:tc>
+        <w:tc>
+          <w:tcPr>
+            <w:tcW w:type="dxa" w:w="2700"/>
+            <w:tcBorders>
+              <w:top w:val="single" w:color="CCCCCC" w:sz="1"/>
+              <w:left w:val="single" w:color="CCCCCC" w:sz="1"/>
+              <w:bottom w:val="single" w:color="CCCCCC" w:sz="1"/>
+              <w:right w:val="single" w:color="CCCCCC" w:sz="1"/>
+            </w:tcBorders>
+            <w:shd w:fill="FFFFFF" w:val="clear"/>
+            <w:tcMar>
+              <w:top w:type="dxa" w:w="80"/>
+              <w:left w:type="dxa" w:w="120"/>
+              <w:bottom w:type="dxa" w:w="80"/>
+              <w:right w:type="dxa" w:w="120"/>
+            </w:tcMar>
+            <w:vAlign w:val="top"/>
+          </w:tcPr>
+          <w:p>
+            <w:r>
+              <w:rPr>
+                <w:rFonts w:ascii="Arial" w:cs="Arial" w:eastAsia="Arial" w:hAnsi="Arial"/>
+                <w:b w:val="false"/>
+                <w:bCs w:val="false"/>
+                <w:sz w:val="22"/>
+                <w:szCs w:val="22"/>
+              </w:rPr>
+              <w:t xml:space="preserve">Minimising J(w,b) = −(1/m)Σℒ is equivalent to MLE under IID Bernoulli assumption. P(y|x) = ŷʸ(1−ŷ)¹⁻ʸ.</w:t>
+            </w:r>
+          </w:p>
+        </w:tc>
+        <w:tc>
+          <w:tcPr>
+            <w:tcW w:type="dxa" w:w="2600"/>
+            <w:tcBorders>
+              <w:top w:val="single" w:color="CCCCCC" w:sz="1"/>
+              <w:left w:val="single" w:color="CCCCCC" w:sz="1"/>
+              <w:bottom w:val="single" w:color="CCCCCC" w:sz="1"/>
+              <w:right w:val="single" w:color="CCCCCC" w:sz="1"/>
+            </w:tcBorders>
+            <w:shd w:fill="FFFFFF" w:val="clear"/>
+            <w:tcMar>
+              <w:top w:type="dxa" w:w="80"/>
+              <w:left w:type="dxa" w:w="120"/>
+              <w:bottom w:type="dxa" w:w="80"/>
+              <w:right w:type="dxa" w:w="120"/>
+            </w:tcMar>
+            <w:vAlign w:val="top"/>
+          </w:tcPr>
+          <w:p>
+            <w:r>
+              <w:rPr>
+                <w:rFonts w:ascii="Arial" w:cs="Arial" w:eastAsia="Arial" w:hAnsi="Arial"/>
+                <w:b w:val="false"/>
+                <w:bCs w:val="false"/>
+                <w:sz w:val="22"/>
+                <w:szCs w:val="22"/>
+              </w:rPr>
+              <w:t xml:space="preserve">MLE ↔ Cross-Entropy theorem: the MLE solution and the cost minimiser are identical for logistic regression.</w:t>
+            </w:r>
+          </w:p>
+        </w:tc>
+        <w:tc>
+          <w:tcPr>
+            <w:tcW w:type="dxa" w:w="2560"/>
+            <w:tcBorders>
+              <w:top w:val="single" w:color="CCCCCC" w:sz="1"/>
+              <w:left w:val="single" w:color="CCCCCC" w:sz="1"/>
+              <w:bottom w:val="single" w:color="CCCCCC" w:sz="1"/>
+              <w:right w:val="single" w:color="CCCCCC" w:sz="1"/>
+            </w:tcBorders>
+            <w:shd w:fill="FFFFFF" w:val="clear"/>
+            <w:tcMar>
+              <w:top w:type="dxa" w:w="80"/>
+              <w:left w:type="dxa" w:w="120"/>
+              <w:bottom w:type="dxa" w:w="80"/>
+              <w:right w:type="dxa" w:w="120"/>
+            </w:tcMar>
+            <w:vAlign w:val="top"/>
+          </w:tcPr>
+          <w:p>
+            <w:r>
+              <w:rPr>
+                <w:rFonts w:ascii="Arial" w:cs="Arial" w:eastAsia="Arial" w:hAnsi="Arial"/>
+                <w:b w:val="false"/>
+                <w:bCs w:val="false"/>
+                <w:sz w:val="22"/>
+                <w:szCs w:val="22"/>
+              </w:rPr>
+              <w:t xml:space="preserve">Explains why cross-entropy is used for classification; same principle gives MSE for regression, categorical CE for softmax.</w:t>
+            </w:r>
+          </w:p>
+        </w:tc>
+      </w:tr>
     </w:tbl>
     <w:p>
       <w:r>
@@ -8652,7 +9568,7 @@
           <w:sz w:val="32"/>
           <w:szCs w:val="32"/>
         </w:rPr>
-        <w:t xml:space="preserve">9. References</w:t>
+        <w:t xml:space="preserve">10. References</w:t>
       </w:r>
     </w:p>
     <w:p>

</xml_diff>